<commit_message>
feat(profiles): apply the board and school handbook to the school profile
Co-Authored-By: Claude Opus 5.5 <noreply@anthropic.com>
</commit_message>
<xml_diff>
--- a/fixtures/AP-01/bad.docx
+++ b/fixtures/AP-01/bad.docx
@@ -936,7 +936,7 @@
       <w:footerReference xmlns:r="http://schemas.openxmlformats.org/officeDocument/2006/relationships" w:type="default" r:id="rIdF-default"/>
       <w:footerReference xmlns:r="http://schemas.openxmlformats.org/officeDocument/2006/relationships" w:type="first" r:id="rIdF-first"/>
       <w:pgSz w:w="11906" w:h="16838"/>
-      <w:pgMar w:top="1134" w:right="851" w:bottom="1134" w:left="1701" w:header="708" w:footer="708" w:gutter="0"/>
+      <w:pgMar w:top="1134" w:right="567" w:bottom="1134" w:left="1701" w:header="708" w:footer="708" w:gutter="0"/>
       <w:titlePg/>
     </w:sectPr>
   </w:body>
@@ -988,7 +988,7 @@
     <w:pPrDefault>
       <w:pPr>
         <w:spacing w:before="0" w:after="0" w:line="360" w:lineRule="auto"/>
-        <w:ind w:firstLine="709"/>
+        <w:ind w:firstLine="850"/>
         <w:jc w:val="both"/>
       </w:pPr>
     </w:pPrDefault>
@@ -1006,7 +1006,7 @@
       <w:outlineLvl w:val="0"/>
     </w:pPr>
     <w:rPr>
-      <w:sz w:val="28"/>
+      <w:sz w:val="24"/>
     </w:rPr>
   </w:style>
   <w:style w:type="paragraph" w:styleId="Heading2">
@@ -1014,12 +1014,12 @@
     <w:basedOn w:val="a"/>
     <w:pPr>
       <w:keepNext/>
-      <w:ind w:firstLine="709"/>
+      <w:ind w:firstLine="850"/>
       <w:jc w:val="left"/>
       <w:outlineLvl w:val="1"/>
     </w:pPr>
     <w:rPr>
-      <w:sz w:val="28"/>
+      <w:sz w:val="24"/>
     </w:rPr>
   </w:style>
   <w:style w:type="paragraph" w:styleId="Heading3">

</xml_diff>